<commit_message>
Sync CV assets and organize repo structure
</commit_message>
<xml_diff>
--- a/assets/Yaroslavna-Soldatova-CV.docx
+++ b/assets/Yaroslavna-Soldatova-CV.docx
@@ -226,7 +226,7 @@
                 <w:color w:val="58677A"/>
                 <w:sz w:val="21"/>
               </w:rPr>
-              <w:t>Product Manager · внутреннюю платформу перевожу в потенциальный внешний продукт</w:t>
+              <w:t>Product Manager · part-time</w:t>
             </w:r>
           </w:p>
         </w:tc>
@@ -251,7 +251,7 @@
                 <w:color w:val="BC5F3A"/>
                 <w:sz w:val="20"/>
               </w:rPr>
-              <w:t>01.2026 — н.в.</w:t>
+              <w:t>04.2026 — н.в.</w:t>
             </w:r>
           </w:p>
         </w:tc>
@@ -392,7 +392,7 @@
                 <w:color w:val="58677A"/>
                 <w:sz w:val="21"/>
               </w:rPr>
-              <w:t>Strategic Consultant</w:t>
+              <w:t>Strategic Consultant · part-time</w:t>
             </w:r>
           </w:p>
         </w:tc>
@@ -417,7 +417,7 @@
                 <w:color w:val="BC5F3A"/>
                 <w:sz w:val="20"/>
               </w:rPr>
-              <w:t>10.2024 — 03.2026</w:t>
+              <w:t>01.2026 — н.в.</w:t>
             </w:r>
           </w:p>
         </w:tc>
@@ -434,7 +434,7 @@
           <w:color w:val="212833"/>
           <w:sz w:val="21"/>
         </w:rPr>
-        <w:t>Работала с фаундерами и C-level компаний с оборотом 1 млрд+ над продуктовой стратегией, приоритетами роста и системой принятия решений.</w:t>
+        <w:t>Работаю с фаундерами и C-level компаний с оборотом 1 млрд+ над продуктовой стратегией, приоритетами роста, системой принятия решений и оптимизацией бизнес-процессов.</w:t>
       </w:r>
     </w:p>
     <w:p>
@@ -569,7 +569,7 @@
                 <w:color w:val="BC5F3A"/>
                 <w:sz w:val="20"/>
               </w:rPr>
-              <w:t>12.2023 — 10.2024</w:t>
+              <w:t>10.2024 — 03.2026</w:t>
             </w:r>
           </w:p>
         </w:tc>
@@ -586,7 +586,7 @@
           <w:color w:val="212833"/>
           <w:sz w:val="21"/>
         </w:rPr>
-        <w:t>Отвечала за логику развития направления, продуктовую стратегию, roadmap, интеграции, UX, внедрение и техподдержку AI-продуктов для клиник. Работала напрямую с CEO и CPO, принимала решения по развитию направления и соединяла коммерческую, продуктовую и операционную части в единый рабочий поток.</w:t>
+        <w:t>Отвечала за развитие направления, продуктовую стратегию, roadmap, интеграции, UX, внедрение и техподдержку AI-продуктов для клиник. Работала напрямую с CEO и CPO, принимала решения по развитию направления и соединяла коммерческую, продуктовую и операционную части в единый рабочий поток.</w:t>
       </w:r>
     </w:p>
     <w:p>
@@ -1034,7 +1034,7 @@
           <w:color w:val="212833"/>
           <w:sz w:val="21"/>
         </w:rPr>
-        <w:t>Product strategy, Product management, Prioritization, Roadmap, Discovery, JTBD, Customer Development, Stakeholder management, AI / B2B / legacy-системы, stop/go-оценка направлений, риск-менеджмент.</w:t>
+        <w:t>Product strategy, Product management, Prioritization, Roadmap, Discovery, Delivery, JTBD, Customer Development, UX, Stakeholder management, AI / B2B / legacy-системы, data-driven decision, риск-менеджмент.</w:t>
       </w:r>
     </w:p>
     <w:p>

</xml_diff>